<commit_message>
Insert remaining 8 charts into diploma at relevant sections
- 02_fsm_dialog → 3.1.4 FSM bot description
- 03_profile_update → 2.1.2 EMA profile formula
- 04_ranking_formula → 2.2.3 R(i,D,t) definition
- 06_cold_start → 3.3.4 cold start experiment
- 07_embeddings_2d → 1.3.2 LLM embeddings section
- 08_dialog_metrics → 3.3.3 dialog depth analysis
- 09_alpha_sensitivity → 2.1.2 profile model
- 10_tech_stack → 3.1 system architecture

Total: 27 figures in diploma (19 placeholders + 8 additional)

Co-Authored-By: Claude Sonnet 4.6 <noreply@anthropic.com>
</commit_message>
<xml_diff>
--- a/codirank/public/diplom_v2_final.docx
+++ b/codirank/public/diplom_v2_final.docx
@@ -2142,6 +2142,57 @@
           <w:szCs w:val="28"/>
         </w:rPr>
         <w:t xml:space="preserve">	151</w:t>
+      </w:r>
+    </w:p>
+    <w:p>
+      <w:pPr>
+        <w:jc w:val="center"/>
+      </w:pPr>
+      <w:r>
+        <w:drawing>
+          <wp:inline xmlns:a="http://schemas.openxmlformats.org/drawingml/2006/main" xmlns:pic="http://schemas.openxmlformats.org/drawingml/2006/picture">
+            <wp:extent cx="5029200" cy="2197778"/>
+            <wp:docPr id="25" name="Picture 25"/>
+            <wp:cNvGraphicFramePr>
+              <a:graphicFrameLocks noChangeAspect="1"/>
+            </wp:cNvGraphicFramePr>
+            <a:graphic>
+              <a:graphicData uri="http://schemas.openxmlformats.org/drawingml/2006/picture">
+                <pic:pic>
+                  <pic:nvPicPr>
+                    <pic:cNvPr id="0" name="08_dialog_metrics.png"/>
+                    <pic:cNvPicPr/>
+                  </pic:nvPicPr>
+                  <pic:blipFill>
+                    <a:blip r:embed="rId29"/>
+                    <a:stretch>
+                      <a:fillRect/>
+                    </a:stretch>
+                  </pic:blipFill>
+                  <pic:spPr>
+                    <a:xfrm>
+                      <a:off x="0" y="0"/>
+                      <a:ext cx="5029200" cy="2197778"/>
+                    </a:xfrm>
+                    <a:prstGeom prst="rect"/>
+                  </pic:spPr>
+                </pic:pic>
+              </a:graphicData>
+            </a:graphic>
+          </wp:inline>
+        </w:drawing>
+      </w:r>
+    </w:p>
+    <w:p>
+      <w:pPr>
+        <w:jc w:val="center"/>
+      </w:pPr>
+      <w:r>
+        <w:rPr>
+          <w:i/>
+          <w:sz w:val="20"/>
+        </w:rPr>
+        <w:t>Рисунок — Распределение длины диалогов до рекомендации и структура обратной связи</w:t>
       </w:r>
     </w:p>
     <w:p>
@@ -5720,6 +5771,57 @@
     </w:p>
     <w:p>
       <w:pPr>
+        <w:jc w:val="center"/>
+      </w:pPr>
+      <w:r>
+        <w:drawing>
+          <wp:inline xmlns:a="http://schemas.openxmlformats.org/drawingml/2006/main" xmlns:pic="http://schemas.openxmlformats.org/drawingml/2006/picture">
+            <wp:extent cx="5029200" cy="5169737"/>
+            <wp:docPr id="24" name="Picture 24"/>
+            <wp:cNvGraphicFramePr>
+              <a:graphicFrameLocks noChangeAspect="1"/>
+            </wp:cNvGraphicFramePr>
+            <a:graphic>
+              <a:graphicData uri="http://schemas.openxmlformats.org/drawingml/2006/picture">
+                <pic:pic>
+                  <pic:nvPicPr>
+                    <pic:cNvPr id="0" name="07_embeddings_2d.png"/>
+                    <pic:cNvPicPr/>
+                  </pic:nvPicPr>
+                  <pic:blipFill>
+                    <a:blip r:embed="rId28"/>
+                    <a:stretch>
+                      <a:fillRect/>
+                    </a:stretch>
+                  </pic:blipFill>
+                  <pic:spPr>
+                    <a:xfrm>
+                      <a:off x="0" y="0"/>
+                      <a:ext cx="5029200" cy="5169737"/>
+                    </a:xfrm>
+                    <a:prstGeom prst="rect"/>
+                  </pic:spPr>
+                </pic:pic>
+              </a:graphicData>
+            </a:graphic>
+          </wp:inline>
+        </w:drawing>
+      </w:r>
+    </w:p>
+    <w:p>
+      <w:pPr>
+        <w:jc w:val="center"/>
+      </w:pPr>
+      <w:r>
+        <w:rPr>
+          <w:i/>
+          <w:sz w:val="20"/>
+        </w:rPr>
+        <w:t>Рисунок — Визуализация семантического пространства эмбеддингов (t-SNE) и траектория профиля P(t)</w:t>
+      </w:r>
+    </w:p>
+    <w:p>
+      <w:pPr>
         <w:pStyle w:val="Heading3"/>
         <w:spacing w:before="0" w:after="0" w:line="360"/>
         <w:ind w:firstLine="0"/>
@@ -6772,6 +6874,108 @@
     </w:p>
     <w:p>
       <w:pPr>
+        <w:jc w:val="center"/>
+      </w:pPr>
+      <w:r>
+        <w:drawing>
+          <wp:inline xmlns:a="http://schemas.openxmlformats.org/drawingml/2006/main" xmlns:pic="http://schemas.openxmlformats.org/drawingml/2006/picture">
+            <wp:extent cx="5029200" cy="2480619"/>
+            <wp:docPr id="26" name="Picture 26"/>
+            <wp:cNvGraphicFramePr>
+              <a:graphicFrameLocks noChangeAspect="1"/>
+            </wp:cNvGraphicFramePr>
+            <a:graphic>
+              <a:graphicData uri="http://schemas.openxmlformats.org/drawingml/2006/picture">
+                <pic:pic>
+                  <pic:nvPicPr>
+                    <pic:cNvPr id="0" name="09_alpha_sensitivity.png"/>
+                    <pic:cNvPicPr/>
+                  </pic:nvPicPr>
+                  <pic:blipFill>
+                    <a:blip r:embed="rId30"/>
+                    <a:stretch>
+                      <a:fillRect/>
+                    </a:stretch>
+                  </pic:blipFill>
+                  <pic:spPr>
+                    <a:xfrm>
+                      <a:off x="0" y="0"/>
+                      <a:ext cx="5029200" cy="2480619"/>
+                    </a:xfrm>
+                    <a:prstGeom prst="rect"/>
+                  </pic:spPr>
+                </pic:pic>
+              </a:graphicData>
+            </a:graphic>
+          </wp:inline>
+        </w:drawing>
+      </w:r>
+    </w:p>
+    <w:p>
+      <w:pPr>
+        <w:jc w:val="center"/>
+      </w:pPr>
+      <w:r>
+        <w:rPr>
+          <w:i/>
+          <w:sz w:val="20"/>
+        </w:rPr>
+        <w:t>Рисунок — Влияние коэффициента инерции α на скорость сходимости профиля пользователя</w:t>
+      </w:r>
+    </w:p>
+    <w:p>
+      <w:pPr>
+        <w:jc w:val="center"/>
+      </w:pPr>
+      <w:r>
+        <w:drawing>
+          <wp:inline xmlns:a="http://schemas.openxmlformats.org/drawingml/2006/main" xmlns:pic="http://schemas.openxmlformats.org/drawingml/2006/picture">
+            <wp:extent cx="5029200" cy="2006468"/>
+            <wp:docPr id="21" name="Picture 21"/>
+            <wp:cNvGraphicFramePr>
+              <a:graphicFrameLocks noChangeAspect="1"/>
+            </wp:cNvGraphicFramePr>
+            <a:graphic>
+              <a:graphicData uri="http://schemas.openxmlformats.org/drawingml/2006/picture">
+                <pic:pic>
+                  <pic:nvPicPr>
+                    <pic:cNvPr id="0" name="03_profile_update.png"/>
+                    <pic:cNvPicPr/>
+                  </pic:nvPicPr>
+                  <pic:blipFill>
+                    <a:blip r:embed="rId25"/>
+                    <a:stretch>
+                      <a:fillRect/>
+                    </a:stretch>
+                  </pic:blipFill>
+                  <pic:spPr>
+                    <a:xfrm>
+                      <a:off x="0" y="0"/>
+                      <a:ext cx="5029200" cy="2006468"/>
+                    </a:xfrm>
+                    <a:prstGeom prst="rect"/>
+                  </pic:spPr>
+                </pic:pic>
+              </a:graphicData>
+            </a:graphic>
+          </wp:inline>
+        </w:drawing>
+      </w:r>
+    </w:p>
+    <w:p>
+      <w:pPr>
+        <w:jc w:val="center"/>
+      </w:pPr>
+      <w:r>
+        <w:rPr>
+          <w:i/>
+          <w:sz w:val="20"/>
+        </w:rPr>
+        <w:t>Рисунок — Динамика нормы вектора профиля P(t) и влияние весов тональности</w:t>
+      </w:r>
+    </w:p>
+    <w:p>
+      <w:pPr>
         <w:spacing w:after="0" w:line="360"/>
       </w:pPr>
       <w:r>
@@ -7554,6 +7758,57 @@
     </w:p>
     <w:p>
       <w:pPr>
+        <w:jc w:val="center"/>
+      </w:pPr>
+      <w:r>
+        <w:drawing>
+          <wp:inline xmlns:a="http://schemas.openxmlformats.org/drawingml/2006/main" xmlns:pic="http://schemas.openxmlformats.org/drawingml/2006/picture">
+            <wp:extent cx="5029200" cy="2148262"/>
+            <wp:docPr id="22" name="Picture 22"/>
+            <wp:cNvGraphicFramePr>
+              <a:graphicFrameLocks noChangeAspect="1"/>
+            </wp:cNvGraphicFramePr>
+            <a:graphic>
+              <a:graphicData uri="http://schemas.openxmlformats.org/drawingml/2006/picture">
+                <pic:pic>
+                  <pic:nvPicPr>
+                    <pic:cNvPr id="0" name="04_ranking_formula.png"/>
+                    <pic:cNvPicPr/>
+                  </pic:nvPicPr>
+                  <pic:blipFill>
+                    <a:blip r:embed="rId26"/>
+                    <a:stretch>
+                      <a:fillRect/>
+                    </a:stretch>
+                  </pic:blipFill>
+                  <pic:spPr>
+                    <a:xfrm>
+                      <a:off x="0" y="0"/>
+                      <a:ext cx="5029200" cy="2148262"/>
+                    </a:xfrm>
+                    <a:prstGeom prst="rect"/>
+                  </pic:spPr>
+                </pic:pic>
+              </a:graphicData>
+            </a:graphic>
+          </wp:inline>
+        </w:drawing>
+      </w:r>
+    </w:p>
+    <w:p>
+      <w:pPr>
+        <w:jc w:val="center"/>
+      </w:pPr>
+      <w:r>
+        <w:rPr>
+          <w:i/>
+          <w:sz w:val="20"/>
+        </w:rPr>
+        <w:t>Рисунок — Декомпозиция оценки R(i,D,t) и веса компонентов ранжирования</w:t>
+      </w:r>
+    </w:p>
+    <w:p>
+      <w:pPr>
         <w:spacing w:after="0" w:line="360"/>
         <w:ind w:firstLine="0"/>
         <w:jc w:val="center"/>
@@ -8491,6 +8746,57 @@
     </w:p>
     <w:p>
       <w:pPr>
+        <w:jc w:val="center"/>
+      </w:pPr>
+      <w:r>
+        <w:drawing>
+          <wp:inline xmlns:a="http://schemas.openxmlformats.org/drawingml/2006/main" xmlns:pic="http://schemas.openxmlformats.org/drawingml/2006/picture">
+            <wp:extent cx="5029200" cy="2486346"/>
+            <wp:docPr id="27" name="Picture 27"/>
+            <wp:cNvGraphicFramePr>
+              <a:graphicFrameLocks noChangeAspect="1"/>
+            </wp:cNvGraphicFramePr>
+            <a:graphic>
+              <a:graphicData uri="http://schemas.openxmlformats.org/drawingml/2006/picture">
+                <pic:pic>
+                  <pic:nvPicPr>
+                    <pic:cNvPr id="0" name="10_tech_stack.png"/>
+                    <pic:cNvPicPr/>
+                  </pic:nvPicPr>
+                  <pic:blipFill>
+                    <a:blip r:embed="rId31"/>
+                    <a:stretch>
+                      <a:fillRect/>
+                    </a:stretch>
+                  </pic:blipFill>
+                  <pic:spPr>
+                    <a:xfrm>
+                      <a:off x="0" y="0"/>
+                      <a:ext cx="5029200" cy="2486346"/>
+                    </a:xfrm>
+                    <a:prstGeom prst="rect"/>
+                  </pic:spPr>
+                </pic:pic>
+              </a:graphicData>
+            </a:graphic>
+          </wp:inline>
+        </w:drawing>
+      </w:r>
+    </w:p>
+    <w:p>
+      <w:pPr>
+        <w:jc w:val="center"/>
+      </w:pPr>
+      <w:r>
+        <w:rPr>
+          <w:i/>
+          <w:sz w:val="20"/>
+        </w:rPr>
+        <w:t>Рисунок — Технологический стек системы CoDiRank</w:t>
+      </w:r>
+    </w:p>
+    <w:p>
+      <w:pPr>
         <w:spacing w:after="0" w:line="360"/>
         <w:ind w:firstLine="0"/>
         <w:jc w:val="center"/>
@@ -9434,6 +9740,57 @@
     </w:p>
     <w:p>
       <w:pPr>
+        <w:jc w:val="center"/>
+      </w:pPr>
+      <w:r>
+        <w:drawing>
+          <wp:inline xmlns:a="http://schemas.openxmlformats.org/drawingml/2006/main" xmlns:pic="http://schemas.openxmlformats.org/drawingml/2006/picture">
+            <wp:extent cx="5029200" cy="2062537"/>
+            <wp:docPr id="20" name="Picture 20"/>
+            <wp:cNvGraphicFramePr>
+              <a:graphicFrameLocks noChangeAspect="1"/>
+            </wp:cNvGraphicFramePr>
+            <a:graphic>
+              <a:graphicData uri="http://schemas.openxmlformats.org/drawingml/2006/picture">
+                <pic:pic>
+                  <pic:nvPicPr>
+                    <pic:cNvPr id="0" name="02_fsm_dialog.png"/>
+                    <pic:cNvPicPr/>
+                  </pic:nvPicPr>
+                  <pic:blipFill>
+                    <a:blip r:embed="rId24"/>
+                    <a:stretch>
+                      <a:fillRect/>
+                    </a:stretch>
+                  </pic:blipFill>
+                  <pic:spPr>
+                    <a:xfrm>
+                      <a:off x="0" y="0"/>
+                      <a:ext cx="5029200" cy="2062537"/>
+                    </a:xfrm>
+                    <a:prstGeom prst="rect"/>
+                  </pic:spPr>
+                </pic:pic>
+              </a:graphicData>
+            </a:graphic>
+          </wp:inline>
+        </w:drawing>
+      </w:r>
+    </w:p>
+    <w:p>
+      <w:pPr>
+        <w:jc w:val="center"/>
+      </w:pPr>
+      <w:r>
+        <w:rPr>
+          <w:i/>
+          <w:sz w:val="20"/>
+        </w:rPr>
+        <w:t>Рисунок — Граф состояний конечного автомата (FSM) диалога бота</w:t>
+      </w:r>
+    </w:p>
+    <w:p>
+      <w:pPr>
         <w:spacing w:after="0" w:line="360"/>
         <w:ind w:firstLine="0"/>
         <w:jc w:val="center"/>
@@ -11121,6 +11478,57 @@
           <w:szCs w:val="28"/>
         </w:rPr>
         <w:t xml:space="preserve">3.4 Анализ результатов и ограничений системы</w:t>
+      </w:r>
+    </w:p>
+    <w:p>
+      <w:pPr>
+        <w:jc w:val="center"/>
+      </w:pPr>
+      <w:r>
+        <w:drawing>
+          <wp:inline xmlns:a="http://schemas.openxmlformats.org/drawingml/2006/main" xmlns:pic="http://schemas.openxmlformats.org/drawingml/2006/picture">
+            <wp:extent cx="5029200" cy="2006468"/>
+            <wp:docPr id="23" name="Picture 23"/>
+            <wp:cNvGraphicFramePr>
+              <a:graphicFrameLocks noChangeAspect="1"/>
+            </wp:cNvGraphicFramePr>
+            <a:graphic>
+              <a:graphicData uri="http://schemas.openxmlformats.org/drawingml/2006/picture">
+                <pic:pic>
+                  <pic:nvPicPr>
+                    <pic:cNvPr id="0" name="06_cold_start_comparison.png"/>
+                    <pic:cNvPicPr/>
+                  </pic:nvPicPr>
+                  <pic:blipFill>
+                    <a:blip r:embed="rId27"/>
+                    <a:stretch>
+                      <a:fillRect/>
+                    </a:stretch>
+                  </pic:blipFill>
+                  <pic:spPr>
+                    <a:xfrm>
+                      <a:off x="0" y="0"/>
+                      <a:ext cx="5029200" cy="2006468"/>
+                    </a:xfrm>
+                    <a:prstGeom prst="rect"/>
+                  </pic:spPr>
+                </pic:pic>
+              </a:graphicData>
+            </a:graphic>
+          </wp:inline>
+        </w:drawing>
+      </w:r>
+    </w:p>
+    <w:p>
+      <w:pPr>
+        <w:jc w:val="center"/>
+      </w:pPr>
+      <w:r>
+        <w:rPr>
+          <w:i/>
+          <w:sz w:val="20"/>
+        </w:rPr>
+        <w:t>Рисунок — Сравнение методов рекомендаций в условиях холодного старта</w:t>
       </w:r>
     </w:p>
     <w:p>

</xml_diff>